<commit_message>
GroupDocs.Annotation for .NET 26.6 Examples update
</commit_message>
<xml_diff>
--- a/Examples/GroupDocs.Annotation.Examples.CSharp/Resources/SampleFiles/annotated.docx
+++ b/Examples/GroupDocs.Annotation.Examples.CSharp/Resources/SampleFiles/annotated.docx
@@ -1,7 +1,7 @@
 
 <file path=word/document.xml><?xml version="1.0" encoding="utf-8"?>
 <w:document xmlns:wpc="http://schemas.microsoft.com/office/word/2010/wordprocessingCanvas" xmlns:cx="http://schemas.microsoft.com/office/drawing/2014/chartex" xmlns:cx1="http://schemas.microsoft.com/office/drawing/2015/9/8/chartex" xmlns:cx2="http://schemas.microsoft.com/office/drawing/2015/10/21/chartex" xmlns:cx3="http://schemas.microsoft.com/office/drawing/2016/5/9/chartex" xmlns:cx4="http://schemas.microsoft.com/office/drawing/2016/5/10/chartex" xmlns:cx5="http://schemas.microsoft.com/office/drawing/2016/5/11/chartex" xmlns:mc="http://schemas.openxmlformats.org/markup-compatibility/2006" xmlns:o="urn:schemas-microsoft-com:office:office" xmlns:r="http://schemas.openxmlformats.org/officeDocument/2006/relationships" xmlns:m="http://schemas.openxmlformats.org/officeDocument/2006/math" xmlns:v="urn:schemas-microsoft-com:vml" xmlns:wp14="http://schemas.microsoft.com/office/word/2010/wordprocessingDrawing" xmlns:wp="http://schemas.openxmlformats.org/drawingml/2006/wordprocessingDrawing" xmlns:w10="urn:schemas-microsoft-com:office:word" xmlns:w="http://schemas.openxmlformats.org/wordprocessingml/2006/main" xmlns:w14="http://schemas.microsoft.com/office/word/2010/wordml" xmlns:w15="http://schemas.microsoft.com/office/word/2012/wordml" xmlns:wne="http://schemas.microsoft.com/office/word/2006/wordml" xmlns:wpg="http://schemas.microsoft.com/office/word/2010/wordprocessingGroup" xmlns:wpi="http://schemas.microsoft.com/office/word/2010/wordprocessingInk" xmlns:wps="http://schemas.microsoft.com/office/word/2010/wordprocessingShape" mc:Ignorable="w14 w15 wp14">
-  <!-- Generated by Aspose.Words for .NET 19.6 -->
+  <!-- Generated by Aspose.Words for .NET 26.5.0 -->
   <w:body>
     <w:p>
       <w:pPr>
@@ -22,30 +22,6 @@
             <v:fill opacity="0.5"/>
           </v:rect>
         </w:pict>
-      </w:r>
-      <w:r>
-        <w:rPr>
-          <w:rStyle w:val="CommentReference"/>
-        </w:rPr>
-        <w:commentReference w:id="0"/>
-      </w:r>
-      <w:r>
-        <w:rPr>
-          <w:rStyle w:val="CommentReference"/>
-        </w:rPr>
-        <w:commentReference w:id="1"/>
-      </w:r>
-      <w:r>
-        <w:rPr>
-          <w:rStyle w:val="CommentReference"/>
-        </w:rPr>
-        <w:commentReference w:id="2"/>
-      </w:r>
-      <w:r>
-        <w:rPr>
-          <w:rStyle w:val="CommentReference"/>
-        </w:rPr>
-        <w:commentReference w:id="3"/>
       </w:r>
       <w:r>
         <w:t>Dima`s</w:t>
@@ -2743,18 +2719,6 @@
       </w:r>
       <w:r>
         <w:rPr>
-          <w:rStyle w:val="CommentReference"/>
-        </w:rPr>
-        <w:commentReference w:id="4"/>
-      </w:r>
-      <w:r>
-        <w:rPr>
-          <w:rStyle w:val="CommentReference"/>
-        </w:rPr>
-        <w:commentReference w:id="5"/>
-      </w:r>
-      <w:r>
-        <w:rPr>
           <w:color w:val="000000"/>
           <w:sz w:val="28"/>
           <w:szCs w:val="28"/>
@@ -2908,18 +2872,6 @@
       </w:pPr>
       <w:r>
         <w:rPr>
-          <w:rStyle w:val="CommentReference"/>
-        </w:rPr>
-        <w:commentReference w:id="6"/>
-      </w:r>
-      <w:r>
-        <w:rPr>
-          <w:rStyle w:val="CommentReference"/>
-        </w:rPr>
-        <w:commentReference w:id="7"/>
-      </w:r>
-      <w:r>
-        <w:rPr>
           <w:color w:val="000000"/>
           <w:sz w:val="28"/>
           <w:szCs w:val="28"/>
@@ -4063,8 +4015,8 @@
         </w:rPr>
         <w:t xml:space="preserve"> libero </w:t>
       </w:r>
-      <w:bookmarkStart w:id="8" w:name="_GoBack"/>
-      <w:bookmarkEnd w:id="8"/>
+      <w:bookmarkStart w:id="0" w:name="_GoBack"/>
+      <w:bookmarkEnd w:id="0"/>
       <w:r>
         <w:rPr>
           <w:color w:val="000000"/>
@@ -5440,140 +5392,6 @@
     </w:sectPr>
   </w:body>
 </w:document>
-</file>
-
-<file path=word/comments.xml><?xml version="1.0" encoding="utf-8"?>
-<w:comments xmlns:wpc="http://schemas.microsoft.com/office/word/2010/wordprocessingCanvas" xmlns:cx="http://schemas.microsoft.com/office/drawing/2014/chartex" xmlns:cx1="http://schemas.microsoft.com/office/drawing/2015/9/8/chartex" xmlns:cx2="http://schemas.microsoft.com/office/drawing/2015/10/21/chartex" xmlns:cx3="http://schemas.microsoft.com/office/drawing/2016/5/9/chartex" xmlns:cx4="http://schemas.microsoft.com/office/drawing/2016/5/10/chartex" xmlns:cx5="http://schemas.microsoft.com/office/drawing/2016/5/11/chartex" xmlns:mc="http://schemas.openxmlformats.org/markup-compatibility/2006" xmlns:o="urn:schemas-microsoft-com:office:office" xmlns:r="http://schemas.openxmlformats.org/officeDocument/2006/relationships" xmlns:m="http://schemas.openxmlformats.org/officeDocument/2006/math" xmlns:v="urn:schemas-microsoft-com:vml" xmlns:wp14="http://schemas.microsoft.com/office/word/2010/wordprocessingDrawing" xmlns:wp="http://schemas.openxmlformats.org/drawingml/2006/wordprocessingDrawing" xmlns:w10="urn:schemas-microsoft-com:office:word" xmlns:w="http://schemas.openxmlformats.org/wordprocessingml/2006/main" xmlns:w14="http://schemas.microsoft.com/office/word/2010/wordml" xmlns:w15="http://schemas.microsoft.com/office/word/2012/wordml" xmlns:wne="http://schemas.microsoft.com/office/word/2006/wordml" xmlns:wpg="http://schemas.microsoft.com/office/word/2010/wordprocessingGroup" xmlns:wpi="http://schemas.microsoft.com/office/word/2010/wordprocessingInk" xmlns:wps="http://schemas.microsoft.com/office/word/2010/wordprocessingShape" mc:Ignorable="w14 w15 wp14">
-  <w:comment w:id="0" w:author="Anonym A." w:date="2018-05-11T12:05:27Z" w:initials="AU">
-    <w:p>
-      <w:pPr>
-        <w:pStyle w:val="CommentText"/>
-      </w:pPr>
-      <w:r>
-        <w:rPr>
-          <w:rStyle w:val="CommentReference"/>
-        </w:rPr>
-        <w:annotationRef/>
-      </w:r>
-    </w:p>
-  </w:comment>
-  <w:comment w:id="1" w:author="Admin" w:date="2017-12-07T16:28:26Z" w:initials="AU">
-    <w:p>
-      <w:pPr>
-        <w:pStyle w:val="CommentText"/>
-      </w:pPr>
-      <w:r>
-        <w:rPr>
-          <w:rStyle w:val="CommentReference"/>
-        </w:rPr>
-        <w:annotationRef/>
-      </w:r>
-      <w:r>
-        <w:t>first page, clear</w:t>
-      </w:r>
-    </w:p>
-  </w:comment>
-  <w:comment w:id="2" w:author="Anonym A." w:date="2018-05-11T12:05:27Z" w:initials="AU">
-    <w:p>
-      <w:pPr>
-        <w:pStyle w:val="CommentText"/>
-      </w:pPr>
-      <w:r>
-        <w:rPr>
-          <w:rStyle w:val="CommentReference"/>
-        </w:rPr>
-        <w:annotationRef/>
-      </w:r>
-    </w:p>
-  </w:comment>
-  <w:comment w:id="3" w:author="John" w:date="2017-12-07T16:28:26Z" w:initials="AU">
-    <w:p>
-      <w:pPr>
-        <w:pStyle w:val="CommentText"/>
-      </w:pPr>
-      <w:r>
-        <w:rPr>
-          <w:rStyle w:val="CommentReference"/>
-        </w:rPr>
-        <w:annotationRef/>
-      </w:r>
-      <w:r>
-        <w:t>first page, with properties</w:t>
-      </w:r>
-    </w:p>
-  </w:comment>
-  <w:comment w:id="4" w:author="Anonym A." w:date="2018-05-11T12:05:27Z" w:initials="AU">
-    <w:p>
-      <w:pPr>
-        <w:pStyle w:val="CommentText"/>
-      </w:pPr>
-      <w:r>
-        <w:rPr>
-          <w:rStyle w:val="CommentReference"/>
-        </w:rPr>
-        <w:annotationRef/>
-      </w:r>
-    </w:p>
-  </w:comment>
-  <w:comment w:id="5" w:author="Admin" w:date="2017-12-07T16:28:26Z" w:initials="AU">
-    <w:p>
-      <w:pPr>
-        <w:pStyle w:val="CommentText"/>
-      </w:pPr>
-      <w:r>
-        <w:rPr>
-          <w:rStyle w:val="CommentReference"/>
-        </w:rPr>
-        <w:annotationRef/>
-      </w:r>
-      <w:r>
-        <w:t>second page, with properties</w:t>
-      </w:r>
-    </w:p>
-  </w:comment>
-  <w:comment w:id="6" w:author="Anonym A." w:date="2018-05-11T12:05:27Z" w:initials="AU">
-    <w:p>
-      <w:pPr>
-        <w:pStyle w:val="CommentText"/>
-      </w:pPr>
-      <w:r>
-        <w:rPr>
-          <w:rStyle w:val="CommentReference"/>
-        </w:rPr>
-        <w:annotationRef/>
-      </w:r>
-    </w:p>
-  </w:comment>
-  <w:comment w:id="7" w:author="Jack" w:date="2017-12-07T16:28:26Z" w:initials="AU">
-    <w:p>
-      <w:pPr>
-        <w:pStyle w:val="CommentText"/>
-      </w:pPr>
-      <w:r>
-        <w:rPr>
-          <w:rStyle w:val="CommentReference"/>
-        </w:rPr>
-        <w:annotationRef/>
-      </w:r>
-      <w:r>
-        <w:t>second page, with proprties</w:t>
-      </w:r>
-    </w:p>
-  </w:comment>
-</w:comments>
-</file>
-
-<file path=word/commentsExtended.xml><?xml version="1.0" encoding="utf-8"?>
-<w15:commentsEx xmlns:wpc="http://schemas.microsoft.com/office/word/2010/wordprocessingCanvas" xmlns:cx="http://schemas.microsoft.com/office/drawing/2014/chartex" xmlns:cx1="http://schemas.microsoft.com/office/drawing/2015/9/8/chartex" xmlns:cx2="http://schemas.microsoft.com/office/drawing/2015/10/21/chartex" xmlns:cx3="http://schemas.microsoft.com/office/drawing/2016/5/9/chartex" xmlns:cx4="http://schemas.microsoft.com/office/drawing/2016/5/10/chartex" xmlns:cx5="http://schemas.microsoft.com/office/drawing/2016/5/11/chartex" xmlns:mc="http://schemas.openxmlformats.org/markup-compatibility/2006" xmlns:o="urn:schemas-microsoft-com:office:office" xmlns:r="http://schemas.openxmlformats.org/officeDocument/2006/relationships" xmlns:m="http://schemas.openxmlformats.org/officeDocument/2006/math" xmlns:v="urn:schemas-microsoft-com:vml" xmlns:wp14="http://schemas.microsoft.com/office/word/2010/wordprocessingDrawing" xmlns:wp="http://schemas.openxmlformats.org/drawingml/2006/wordprocessingDrawing" xmlns:w10="urn:schemas-microsoft-com:office:word" xmlns:w="http://schemas.openxmlformats.org/wordprocessingml/2006/main" xmlns:w14="http://schemas.microsoft.com/office/word/2010/wordml" xmlns:w15="http://schemas.microsoft.com/office/word/2012/wordml" xmlns:wne="http://schemas.microsoft.com/office/word/2006/wordml" xmlns:wpg="http://schemas.microsoft.com/office/word/2010/wordprocessingGroup" xmlns:wpi="http://schemas.microsoft.com/office/word/2010/wordprocessingInk" xmlns:wps="http://schemas.microsoft.com/office/word/2010/wordprocessingShape" mc:Ignorable="w14 w15 wp14">
-  <w15:commentEx w15:paraId="2E45E83D" w15:done="0"/>
-  <w15:commentEx w15:paraId="15DDE784" w15:paraIdParent="2E45E83D" w15:done="0"/>
-  <w15:commentEx w15:paraId="0E709156" w15:done="0"/>
-  <w15:commentEx w15:paraId="5D077BB4" w15:paraIdParent="0E709156" w15:done="0"/>
-  <w15:commentEx w15:paraId="7513351B" w15:done="0"/>
-  <w15:commentEx w15:paraId="2261A136" w15:paraIdParent="7513351B" w15:done="0"/>
-  <w15:commentEx w15:paraId="48D4D6A6" w15:done="0"/>
-  <w15:commentEx w15:paraId="09937A1E" w15:paraIdParent="48D4D6A6" w15:done="0"/>
-</w15:commentsEx>
 </file>
 
 <file path=word/endnotes.xml><?xml version="1.0" encoding="utf-8"?>

</xml_diff>